<commit_message>
fix(lecons): argumente la limite manipulation (leçon hypnose n°11)
- Le pont pro affirmait « ce n'est pas de la manipulation » sans
  l'argumenter. Deux conditions vérifiables sont désormais posées :
  transparence du but et possibilité de contredire — si l'une manque,
  c'est de la manipulation quelle que soit l'intention.
- Le cadrage « équipe en résistance » est retourné : une objection est
  une information sur ce qui coince, à entendre avant d'être contournée.
- « Compétence propre aux managers de terrain » : affirmation sans
  fondement, reformulée en constat prudent.
- Sources : l'introduction dit d'où parlent les cinq sites commerciaux
  de la liste, et le rapport Inserm 2015 sur l'efficacité de l'hypnose
  est ajouté (testé ce jour).

Formulations d'origine conservées dans le journal des corrections.

Co-Authored-By: Claude Opus 5 <noreply@anthropic.com>
</commit_message>
<xml_diff>
--- a/livrables/lecons/2026-08-25_lecon-hypnose_11_metaphores-therapeutiques-histoires.docx
+++ b/livrables/lecons/2026-08-25_lecon-hypnose_11_metaphores-therapeutiques-histoires.docx
@@ -1853,21 +1853,21 @@
                 <w:sz w:val="22"/>
                 <w:szCs w:val="22"/>
               </w:rPr>
-              <w:t xml:space="preserve">Le récit et la métaphore sont aussi des outils de communication managériale. Face à une équipe en résistance face à un changement, une anecdote concrète illustrant l'enjeu peut faire passer un message là où un argumentaire rationnel se heurte à des objections.</w:t>
-            </w:r>
-          </w:p>
-          <w:p>
-            <w:pPr>
-              <w:spacing w:after="80"/>
-            </w:pPr>
-            <w:r>
-              <w:rPr>
-                <w:rFonts w:ascii="Times New Roman" w:cs="Times New Roman" w:eastAsia="Times New Roman" w:hAnsi="Times New Roman"/>
-                <w:color w:val="1F2937"/>
-                <w:sz w:val="22"/>
-                <w:szCs w:val="22"/>
-              </w:rPr>
-              <w:t xml:space="preserve">Ce n'est pas de la manipulation : c'est reconnaître que le sens se construit par le vécu et l'image autant que par la logique. Cette compétence — choisir la bonne histoire pour le bon moment — est propre aux managers de terrain qui ont une longue expérience du terrain.</w:t>
+              <w:t xml:space="preserve">Le récit et la métaphore sont aussi des outils de communication managériale. Face à une équipe réticente devant un changement, une anecdote concrète illustrant l'enjeu rend souvent le propos plus tangible qu'un argumentaire abstrait. Attention toutefois au cadrage : parler de « résistance au changement » désigne déjà l'équipe comme l'obstacle. Une objection est d'abord une information sur ce qui coince — charge de travail, expérience passée, désaccord de fond — et elle mérite d'être entendue avant d'être contournée.</w:t>
+            </w:r>
+          </w:p>
+          <w:p>
+            <w:pPr>
+              <w:spacing w:after="80"/>
+            </w:pPr>
+            <w:r>
+              <w:rPr>
+                <w:rFonts w:ascii="Times New Roman" w:cs="Times New Roman" w:eastAsia="Times New Roman" w:hAnsi="Times New Roman"/>
+                <w:color w:val="1F2937"/>
+                <w:sz w:val="22"/>
+                <w:szCs w:val="22"/>
+              </w:rPr>
+              <w:t xml:space="preserve">Où passe la limite ? Pas dans l'intention — tout le monde croit la sienne bonne — mais dans DEUX conditions vérifiables. D'abord la transparence du but : l'équipe sait ce qu'on lui demande et pourquoi ; le récit illustre la demande, il ne la remplace pas. Ensuite la possibilité de contredire : après l'histoire, l'objection reste recevable et trouve un espace réel pour s'exprimer. Si l'une des deux manque, on n'est plus dans l'illustration mais dans le contournement — et c'est bien de la manipulation, quelle que soit la qualité de l'intention. Choisir la bonne histoire au bon moment s'apprend surtout par l'expérience du terrain — mais rien ne permet d'affirmer que ce serait une compétence réservée à une catégorie de managers.</w:t>
             </w:r>
           </w:p>
           <w:p>
@@ -1920,7 +1920,7 @@
           <w:sz w:val="22"/>
           <w:szCs w:val="22"/>
         </w:rPr>
-        <w:t xml:space="preserve">Sources consultées et vérifiées (HTTP 200) durant cette exécution :</w:t>
+        <w:t xml:space="preserve">Sources consultées et vérifiées (HTTP 200) durant cette exécution. ⚠️ Lis-les en sachant d'où elles parlent : hormis la Fondation Erickson et le rapport de l'Inserm ajouté ci-dessous, l'essentiel de cette liste est constitué de sites de praticiens et d'organismes de formation en hypnothérapie — utiles pour décrire une pratique, sans valeur probante sur son efficacité. La leçon 10 s'appuyait sur des travaux publiés dans des revues à comité de lecture ; ce n'est pas le cas ici, et cela doit peser sur la confiance accordée aux mécanismes décrits.</w:t>
       </w:r>
     </w:p>
     <w:p>
@@ -2094,6 +2094,46 @@
       <w:pPr>
         <w:spacing w:after="80"/>
       </w:pPr>
+    </w:p>
+    <w:p>
+      <w:pPr>
+        <w:spacing w:after="80" w:before="80"/>
+      </w:pPr>
+      <w:r>
+        <w:rPr>
+          <w:rFonts w:ascii="Times New Roman" w:cs="Times New Roman" w:eastAsia="Times New Roman" w:hAnsi="Times New Roman"/>
+          <w:color w:val="1F2937"/>
+          <w:sz w:val="22"/>
+          <w:szCs w:val="22"/>
+        </w:rPr>
+        <w:t xml:space="preserve">Source institutionnelle ajoutée le 25/08/2026, testée ce jour (200) :</w:t>
+      </w:r>
+    </w:p>
+    <w:p>
+      <w:pPr>
+        <w:spacing w:after="80" w:before="80"/>
+      </w:pPr>
+      <w:r>
+        <w:rPr>
+          <w:rFonts w:ascii="Times New Roman" w:cs="Times New Roman" w:eastAsia="Times New Roman" w:hAnsi="Times New Roman"/>
+          <w:color w:val="1F2937"/>
+          <w:sz w:val="22"/>
+          <w:szCs w:val="22"/>
+        </w:rPr>
+        <w:t xml:space="preserve">→ </w:t>
+      </w:r>
+      <w:hyperlink w:history="1" r:id="rIdinsermhypnose2015r">
+        <w:r>
+          <w:rPr>
+            <w:rFonts w:ascii="Times New Roman" w:cs="Times New Roman" w:eastAsia="Times New Roman" w:hAnsi="Times New Roman"/>
+            <w:color w:val="1155CC"/>
+            <w:sz w:val="22"/>
+            <w:szCs w:val="22"/>
+            <w:u w:val="single"/>
+          </w:rPr>
+          <w:t xml:space="preserve">Inserm — Évaluation de l'efficacité de la pratique de l'hypnose (2015) : expertise de plus de 200 pages réalisée à la demande de la Direction générale de la santé, distinguant hypnosédation, hypnoanalgésie et hypnothérapie. C'est la référence française pour savoir ce qui est établi et ce qui ne l'est pas — et elle ne traite pas de la métaphore isolément, ce qui confirme le constat de la section 5.</w:t>
+        </w:r>
+      </w:hyperlink>
     </w:p>
     <w:p>
       <w:pPr>
@@ -2173,6 +2213,162 @@
       <w:pPr>
         <w:spacing w:after="80"/>
       </w:pPr>
+    </w:p>
+    <w:p>
+      <w:pPr>
+        <w:spacing w:after="120" w:before="320"/>
+      </w:pPr>
+      <w:r>
+        <w:rPr>
+          <w:rFonts w:ascii="Times New Roman" w:cs="Times New Roman" w:eastAsia="Times New Roman" w:hAnsi="Times New Roman"/>
+          <w:b/>
+          <w:bCs/>
+          <w:color w:val="1B3A6B"/>
+          <w:sz w:val="30"/>
+          <w:szCs w:val="30"/>
+        </w:rPr>
+        <w:t xml:space="preserve">📝 Journal des corrections</w:t>
+      </w:r>
+    </w:p>
+    <w:p>
+      <w:pPr>
+        <w:spacing w:after="80" w:before="80"/>
+      </w:pPr>
+      <w:r>
+        <w:rPr>
+          <w:rFonts w:ascii="Times New Roman" w:cs="Times New Roman" w:eastAsia="Times New Roman" w:hAnsi="Times New Roman"/>
+          <w:color w:val="1F2937"/>
+          <w:sz w:val="22"/>
+          <w:szCs w:val="22"/>
+        </w:rPr>
+        <w:t xml:space="preserve">Leçon produite et relue le 25/08/2026. Les corrections sont fondues dans le texte ci-dessus ; les formulations d'origine sont conservées ici.</w:t>
+      </w:r>
+    </w:p>
+    <w:p>
+      <w:pPr>
+        <w:spacing w:after="80" w:before="80"/>
+      </w:pPr>
+      <w:r>
+        <w:rPr>
+          <w:rFonts w:ascii="Times New Roman" w:cs="Times New Roman" w:eastAsia="Times New Roman" w:hAnsi="Times New Roman"/>
+          <w:color w:val="1F2937"/>
+          <w:sz w:val="22"/>
+          <w:szCs w:val="22"/>
+        </w:rPr>
+        <w:t xml:space="preserve">1. Pont pro — « ce n'est pas de la manipulation » était affirmé, pas argumenté.</w:t>
+      </w:r>
+    </w:p>
+    <w:p>
+      <w:pPr>
+        <w:spacing w:after="80" w:before="80"/>
+      </w:pPr>
+      <w:r>
+        <w:rPr>
+          <w:rFonts w:ascii="Times New Roman" w:cs="Times New Roman" w:eastAsia="Times New Roman" w:hAnsi="Times New Roman"/>
+          <w:color w:val="1F2937"/>
+          <w:sz w:val="22"/>
+          <w:szCs w:val="22"/>
+        </w:rPr>
+        <w:t xml:space="preserve">Version initiale : « Ce n'est pas de la manipulation : c'est reconnaître que le sens se construit par le vécu et l'image autant que par la logique. » Le procédé décrit dans toute la leçon consiste précisément à contourner les résistances et à dissimuler le sens visé à l'esprit conscient : l'appliquer à une équipe demandait mieux qu'une dénégation. Le texte pose désormais deux conditions vérifiables — transparence du but (le récit illustre la demande, il ne la remplace pas) et possibilité de contredire (l'objection reste recevable et trouve un espace réel) — et dit explicitement que si l'une manque, il s'agit bien de manipulation, quelle que soit l'intention.</w:t>
+      </w:r>
+    </w:p>
+    <w:p>
+      <w:pPr>
+        <w:spacing w:after="80" w:before="80"/>
+      </w:pPr>
+      <w:r>
+        <w:rPr>
+          <w:rFonts w:ascii="Times New Roman" w:cs="Times New Roman" w:eastAsia="Times New Roman" w:hAnsi="Times New Roman"/>
+          <w:color w:val="1F2937"/>
+          <w:sz w:val="22"/>
+          <w:szCs w:val="22"/>
+        </w:rPr>
+        <w:t xml:space="preserve">2. Pont pro — le cadrage « résistance au changement ».</w:t>
+      </w:r>
+    </w:p>
+    <w:p>
+      <w:pPr>
+        <w:spacing w:after="80" w:before="80"/>
+      </w:pPr>
+      <w:r>
+        <w:rPr>
+          <w:rFonts w:ascii="Times New Roman" w:cs="Times New Roman" w:eastAsia="Times New Roman" w:hAnsi="Times New Roman"/>
+          <w:color w:val="1F2937"/>
+          <w:sz w:val="22"/>
+          <w:szCs w:val="22"/>
+        </w:rPr>
+        <w:t xml:space="preserve">Version initiale : « Face à une équipe en résistance face à un changement […] là où un argumentaire rationnel se heurte à des objections. » La formule désigne d'emblée l'équipe comme l'obstacle. Le passage rappelle maintenant qu'une objection est d'abord une information sur ce qui coince — charge de travail, expérience passée, désaccord de fond — et qu'elle mérite d'être entendue avant d'être contournée.</w:t>
+      </w:r>
+    </w:p>
+    <w:p>
+      <w:pPr>
+        <w:spacing w:after="80" w:before="80"/>
+      </w:pPr>
+      <w:r>
+        <w:rPr>
+          <w:rFonts w:ascii="Times New Roman" w:cs="Times New Roman" w:eastAsia="Times New Roman" w:hAnsi="Times New Roman"/>
+          <w:color w:val="1F2937"/>
+          <w:sz w:val="22"/>
+          <w:szCs w:val="22"/>
+        </w:rPr>
+        <w:t xml:space="preserve">3. Pont pro — une affirmation sans fondement.</w:t>
+      </w:r>
+    </w:p>
+    <w:p>
+      <w:pPr>
+        <w:spacing w:after="80" w:before="80"/>
+      </w:pPr>
+      <w:r>
+        <w:rPr>
+          <w:rFonts w:ascii="Times New Roman" w:cs="Times New Roman" w:eastAsia="Times New Roman" w:hAnsi="Times New Roman"/>
+          <w:color w:val="1F2937"/>
+          <w:sz w:val="22"/>
+          <w:szCs w:val="22"/>
+        </w:rPr>
+        <w:t xml:space="preserve">Version initiale : « Cette compétence […] est propre aux managers de terrain qui ont une longue expérience du terrain. » Rien ne l'étaye, et la formule se répétait. Reformulée en constat prudent.</w:t>
+      </w:r>
+    </w:p>
+    <w:p>
+      <w:pPr>
+        <w:spacing w:after="80" w:before="80"/>
+      </w:pPr>
+      <w:r>
+        <w:rPr>
+          <w:rFonts w:ascii="Times New Roman" w:cs="Times New Roman" w:eastAsia="Times New Roman" w:hAnsi="Times New Roman"/>
+          <w:color w:val="1F2937"/>
+          <w:sz w:val="22"/>
+          <w:szCs w:val="22"/>
+        </w:rPr>
+        <w:t xml:space="preserve">4. Sources — qualification du corpus et ajout d'une référence institutionnelle.</w:t>
+      </w:r>
+    </w:p>
+    <w:p>
+      <w:pPr>
+        <w:spacing w:after="80" w:before="80"/>
+      </w:pPr>
+      <w:r>
+        <w:rPr>
+          <w:rFonts w:ascii="Times New Roman" w:cs="Times New Roman" w:eastAsia="Times New Roman" w:hAnsi="Times New Roman"/>
+          <w:color w:val="1F2937"/>
+          <w:sz w:val="22"/>
+          <w:szCs w:val="22"/>
+        </w:rPr>
+        <w:t xml:space="preserve">Cinq des neuf références étaient des sites commerciaux d'hypnothérapie ou de formation (hypnosiscredentials.com, selfhypnosis.com, hypnos.co.uk, psychologue.net, hypnose.fr), la seule source institutionnelle étant la Fondation Erickson elle-même — alors que la leçon 10, produite une semaine plus tôt, s'appuyait sur des travaux Inserm de 2022 et sur Scientific Reports 2024. L'introduction des ressources dit désormais d'où parlent ces sites, et le rapport de l'Inserm « Évaluation de l'efficacité de la pratique de l'hypnose » (2015), réalisé à la demande de la Direction générale de la santé, a été ajouté et testé le 25/08/2026. À noter : ce rapport ne traite pas de la métaphore isolément, ce qui confirme plutôt qu'il n'infirme le constat de la section 5.</w:t>
+      </w:r>
+    </w:p>
+    <w:p>
+      <w:pPr>
+        <w:spacing w:after="80" w:before="80"/>
+      </w:pPr>
+      <w:r>
+        <w:rPr>
+          <w:rFonts w:ascii="Times New Roman" w:cs="Times New Roman" w:eastAsia="Times New Roman" w:hAnsi="Times New Roman"/>
+          <w:color w:val="1F2937"/>
+          <w:sz w:val="22"/>
+          <w:szCs w:val="22"/>
+        </w:rPr>
+        <w:t xml:space="preserve">Vérifié lors de la relecture et inchangé : la structure en quatre temps de la métaphore isomorphe ; les cinq types de métaphores ; les quatre mécanismes, dont l'identification projective et la polysémie contrôlée ; la prudence sur l'histoire du cheval perdu, résumée sans guillemets parce que les versions transcrites varient ; et l'ensemble du cadre de sécurité, y compris la contre-indication propre à ce thème et le rappel qu'employer la métaphore sur autrui exige une qualification professionnelle.</w:t>
+      </w:r>
     </w:p>
     <w:sectPr>
       <w:pgSz w:w="11906" w:h="16838" w:orient="portrait"/>

</xml_diff>